<commit_message>
Selection 50/50, broader Humanities eligibility (FEK), C1 English
</commit_message>
<xml_diff>
--- a/pms_study_guide_en.docx
+++ b/pms_study_guide_en.docx
@@ -370,12 +370,6 @@
         <w:gridCol w:w="6026"/>
       </w:tblGrid>
       <w:tr>
-        <w:tblPrEx>
-          <w:tblCellMar>
-            <w:top w:w="0" w:type="dxa"/>
-            <w:bottom w:w="0" w:type="dxa"/>
-          </w:tblCellMar>
-        </w:tblPrEx>
         <w:tc>
           <w:tcPr>
             <w:tcW w:w="3000" w:type="dxa"/>
@@ -433,12 +427,6 @@
         </w:tc>
       </w:tr>
       <w:tr>
-        <w:tblPrEx>
-          <w:tblCellMar>
-            <w:top w:w="0" w:type="dxa"/>
-            <w:bottom w:w="0" w:type="dxa"/>
-          </w:tblCellMar>
-        </w:tblPrEx>
         <w:tc>
           <w:tcPr>
             <w:tcW w:w="3000" w:type="dxa"/>
@@ -496,12 +484,6 @@
         </w:tc>
       </w:tr>
       <w:tr>
-        <w:tblPrEx>
-          <w:tblCellMar>
-            <w:top w:w="0" w:type="dxa"/>
-            <w:bottom w:w="0" w:type="dxa"/>
-          </w:tblCellMar>
-        </w:tblPrEx>
         <w:tc>
           <w:tcPr>
             <w:tcW w:w="3000" w:type="dxa"/>
@@ -559,12 +541,6 @@
         </w:tc>
       </w:tr>
       <w:tr>
-        <w:tblPrEx>
-          <w:tblCellMar>
-            <w:top w:w="0" w:type="dxa"/>
-            <w:bottom w:w="0" w:type="dxa"/>
-          </w:tblCellMar>
-        </w:tblPrEx>
         <w:tc>
           <w:tcPr>
             <w:tcW w:w="3000" w:type="dxa"/>
@@ -656,12 +632,6 @@
         <w:gridCol w:w="9106"/>
       </w:tblGrid>
       <w:tr>
-        <w:tblPrEx>
-          <w:tblCellMar>
-            <w:top w:w="0" w:type="dxa"/>
-            <w:bottom w:w="0" w:type="dxa"/>
-          </w:tblCellMar>
-        </w:tblPrEx>
         <w:tc>
           <w:tcPr>
             <w:tcW w:w="3000" w:type="dxa"/>
@@ -719,12 +689,6 @@
         </w:tc>
       </w:tr>
       <w:tr>
-        <w:tblPrEx>
-          <w:tblCellMar>
-            <w:top w:w="0" w:type="dxa"/>
-            <w:bottom w:w="0" w:type="dxa"/>
-          </w:tblCellMar>
-        </w:tblPrEx>
         <w:tc>
           <w:tcPr>
             <w:tcW w:w="3000" w:type="dxa"/>
@@ -782,12 +746,6 @@
         </w:tc>
       </w:tr>
       <w:tr>
-        <w:tblPrEx>
-          <w:tblCellMar>
-            <w:top w:w="0" w:type="dxa"/>
-            <w:bottom w:w="0" w:type="dxa"/>
-          </w:tblCellMar>
-        </w:tblPrEx>
         <w:tc>
           <w:tcPr>
             <w:tcW w:w="3000" w:type="dxa"/>
@@ -845,12 +803,6 @@
         </w:tc>
       </w:tr>
       <w:tr>
-        <w:tblPrEx>
-          <w:tblCellMar>
-            <w:top w:w="0" w:type="dxa"/>
-            <w:bottom w:w="0" w:type="dxa"/>
-          </w:tblCellMar>
-        </w:tblPrEx>
         <w:tc>
           <w:tcPr>
             <w:tcW w:w="3000" w:type="dxa"/>
@@ -908,12 +860,6 @@
         </w:tc>
       </w:tr>
       <w:tr>
-        <w:tblPrEx>
-          <w:tblCellMar>
-            <w:top w:w="0" w:type="dxa"/>
-            <w:bottom w:w="0" w:type="dxa"/>
-          </w:tblCellMar>
-        </w:tblPrEx>
         <w:tc>
           <w:tcPr>
             <w:tcW w:w="3000" w:type="dxa"/>
@@ -971,12 +917,6 @@
         </w:tc>
       </w:tr>
       <w:tr>
-        <w:tblPrEx>
-          <w:tblCellMar>
-            <w:top w:w="0" w:type="dxa"/>
-            <w:bottom w:w="0" w:type="dxa"/>
-          </w:tblCellMar>
-        </w:tblPrEx>
         <w:tc>
           <w:tcPr>
             <w:tcW w:w="3000" w:type="dxa"/>
@@ -1034,12 +974,6 @@
         </w:tc>
       </w:tr>
       <w:tr>
-        <w:tblPrEx>
-          <w:tblCellMar>
-            <w:top w:w="0" w:type="dxa"/>
-            <w:bottom w:w="0" w:type="dxa"/>
-          </w:tblCellMar>
-        </w:tblPrEx>
         <w:tc>
           <w:tcPr>
             <w:tcW w:w="3000" w:type="dxa"/>
@@ -1097,12 +1031,6 @@
         </w:tc>
       </w:tr>
       <w:tr>
-        <w:tblPrEx>
-          <w:tblCellMar>
-            <w:top w:w="0" w:type="dxa"/>
-            <w:bottom w:w="0" w:type="dxa"/>
-          </w:tblCellMar>
-        </w:tblPrEx>
         <w:tc>
           <w:tcPr>
             <w:tcW w:w="3000" w:type="dxa"/>
@@ -1161,12 +1089,6 @@
         </w:tc>
       </w:tr>
       <w:tr>
-        <w:tblPrEx>
-          <w:tblCellMar>
-            <w:top w:w="0" w:type="dxa"/>
-            <w:bottom w:w="0" w:type="dxa"/>
-          </w:tblCellMar>
-        </w:tblPrEx>
         <w:tc>
           <w:tcPr>
             <w:tcW w:w="3000" w:type="dxa"/>
@@ -1224,12 +1146,6 @@
         </w:tc>
       </w:tr>
       <w:tr>
-        <w:tblPrEx>
-          <w:tblCellMar>
-            <w:top w:w="0" w:type="dxa"/>
-            <w:bottom w:w="0" w:type="dxa"/>
-          </w:tblCellMar>
-        </w:tblPrEx>
         <w:tc>
           <w:tcPr>
             <w:tcW w:w="3000" w:type="dxa"/>
@@ -1308,10 +1224,7 @@
         <w:spacing w:after="120"/>
       </w:pPr>
       <w:r>
-        <w:t>The MA Programme "English Language, Linguistics and Translation" was founded following the publication of Decision No. 707/24-5-2018 by the University Senate regarding the approval of a Regulation of a Postgraduate Study Programme of the Department of English Language and Literature titled "English Language, Linguistics and Translation" (Government Gazette 1729/17-5-18, Vol. 2 and 2359/20.06.2018, Vol. 2; Law 4485/2017, Law 4521/2018). The 2026-2028 cycle of the Translation Studies specialization is offered</w:t>
-      </w:r>
-      <w:r>
-        <w:t xml:space="preserve"> under Government Gazette 1501/B'/17.03.2026 and Law 4957/2022.</w:t>
+        <w:t>The MA Programme "English Language, Linguistics and Translation" was founded following the publication of Decision No. 707/24-5-2018 by the University Senate regarding the approval of a Regulation of a Postgraduate Study Programme of the Department of English Language and Literature titled "English Language, Linguistics and Translation" (Government Gazette 1729/17-5-18, Vol. 2 and 2359/20.06.2018, Vol. 2; Law 4485/2017, Law 4521/2018). The 2026-2028 cycle of the Translation Studies specialization is offered under Government Gazette 1501/B'/17.03.2026 and Law 4957/2022.</w:t>
       </w:r>
     </w:p>
     <w:p>
@@ -1335,10 +1248,7 @@
         <w:spacing w:after="120"/>
       </w:pPr>
       <w:r>
-        <w:t>The maximum time allowed for completing the programme is three (3) academic semesters. Every student is entitled to suspension of studies or of dissertation writing, through a written petition. Suspension is granted by the Assembly, provided that the student has the necessary documentation confirming the need for suspension (such as health-related conditions). In the event of study suspension, the student attends the respective semester of the next study programme of the same specialization, whenever it may</w:t>
-      </w:r>
-      <w:r>
-        <w:t xml:space="preserve"> be offered, and resumes studies from that point onward. Students may suspend their studies only once. Individuals who have filed for suspension do not retain student benefits until they re-enter the programme. The suspension period does not count towards the maximum allowed duration of studies.</w:t>
+        <w:t>The maximum time allowed for completing the programme is three (3) academic semesters. Every student is entitled to suspension of studies or of dissertation writing, through a written petition. Suspension is granted by the Assembly, provided that the student has the necessary documentation confirming the need for suspension (such as health-related conditions). In the event of study suspension, the student attends the respective semester of the next study programme of the same specialization, whenever it may be offered, and resumes studies from that point onward. Students may suspend their studies only once. Individuals who have filed for suspension do not retain student benefits until they re-enter the programme. The suspension period does not count towards the maximum allowed duration of studies.</w:t>
       </w:r>
     </w:p>
     <w:p>
@@ -1549,12 +1459,6 @@
         <w:gridCol w:w="5093"/>
       </w:tblGrid>
       <w:tr>
-        <w:tblPrEx>
-          <w:tblCellMar>
-            <w:top w:w="0" w:type="dxa"/>
-            <w:bottom w:w="0" w:type="dxa"/>
-          </w:tblCellMar>
-        </w:tblPrEx>
         <w:tc>
           <w:tcPr>
             <w:tcW w:w="2800" w:type="dxa"/>
@@ -1644,12 +1548,6 @@
         </w:tc>
       </w:tr>
       <w:tr>
-        <w:tblPrEx>
-          <w:tblCellMar>
-            <w:top w:w="0" w:type="dxa"/>
-            <w:bottom w:w="0" w:type="dxa"/>
-          </w:tblCellMar>
-        </w:tblPrEx>
         <w:tc>
           <w:tcPr>
             <w:tcW w:w="2800" w:type="dxa"/>
@@ -1731,12 +1629,6 @@
         </w:tc>
       </w:tr>
       <w:tr>
-        <w:tblPrEx>
-          <w:tblCellMar>
-            <w:top w:w="0" w:type="dxa"/>
-            <w:bottom w:w="0" w:type="dxa"/>
-          </w:tblCellMar>
-        </w:tblPrEx>
         <w:tc>
           <w:tcPr>
             <w:tcW w:w="2800" w:type="dxa"/>
@@ -1817,12 +1709,6 @@
         </w:tc>
       </w:tr>
       <w:tr>
-        <w:tblPrEx>
-          <w:tblCellMar>
-            <w:top w:w="0" w:type="dxa"/>
-            <w:bottom w:w="0" w:type="dxa"/>
-          </w:tblCellMar>
-        </w:tblPrEx>
         <w:tc>
           <w:tcPr>
             <w:tcW w:w="2800" w:type="dxa"/>
@@ -1903,12 +1789,6 @@
         </w:tc>
       </w:tr>
       <w:tr>
-        <w:tblPrEx>
-          <w:tblCellMar>
-            <w:top w:w="0" w:type="dxa"/>
-            <w:bottom w:w="0" w:type="dxa"/>
-          </w:tblCellMar>
-        </w:tblPrEx>
         <w:tc>
           <w:tcPr>
             <w:tcW w:w="2800" w:type="dxa"/>
@@ -1989,12 +1869,6 @@
         </w:tc>
       </w:tr>
       <w:tr>
-        <w:tblPrEx>
-          <w:tblCellMar>
-            <w:top w:w="0" w:type="dxa"/>
-            <w:bottom w:w="0" w:type="dxa"/>
-          </w:tblCellMar>
-        </w:tblPrEx>
         <w:tc>
           <w:tcPr>
             <w:tcW w:w="2800" w:type="dxa"/>
@@ -2075,12 +1949,6 @@
         </w:tc>
       </w:tr>
       <w:tr>
-        <w:tblPrEx>
-          <w:tblCellMar>
-            <w:top w:w="0" w:type="dxa"/>
-            <w:bottom w:w="0" w:type="dxa"/>
-          </w:tblCellMar>
-        </w:tblPrEx>
         <w:tc>
           <w:tcPr>
             <w:tcW w:w="2800" w:type="dxa"/>
@@ -2161,12 +2029,6 @@
         </w:tc>
       </w:tr>
       <w:tr>
-        <w:tblPrEx>
-          <w:tblCellMar>
-            <w:top w:w="0" w:type="dxa"/>
-            <w:bottom w:w="0" w:type="dxa"/>
-          </w:tblCellMar>
-        </w:tblPrEx>
         <w:tc>
           <w:tcPr>
             <w:tcW w:w="2800" w:type="dxa"/>
@@ -2277,12 +2139,6 @@
         <w:gridCol w:w="6026"/>
       </w:tblGrid>
       <w:tr>
-        <w:tblPrEx>
-          <w:tblCellMar>
-            <w:top w:w="0" w:type="dxa"/>
-            <w:bottom w:w="0" w:type="dxa"/>
-          </w:tblCellMar>
-        </w:tblPrEx>
         <w:tc>
           <w:tcPr>
             <w:tcW w:w="3000" w:type="dxa"/>
@@ -2340,12 +2196,6 @@
         </w:tc>
       </w:tr>
       <w:tr>
-        <w:tblPrEx>
-          <w:tblCellMar>
-            <w:top w:w="0" w:type="dxa"/>
-            <w:bottom w:w="0" w:type="dxa"/>
-          </w:tblCellMar>
-        </w:tblPrEx>
         <w:tc>
           <w:tcPr>
             <w:tcW w:w="3000" w:type="dxa"/>
@@ -2403,12 +2253,6 @@
         </w:tc>
       </w:tr>
       <w:tr>
-        <w:tblPrEx>
-          <w:tblCellMar>
-            <w:top w:w="0" w:type="dxa"/>
-            <w:bottom w:w="0" w:type="dxa"/>
-          </w:tblCellMar>
-        </w:tblPrEx>
         <w:tc>
           <w:tcPr>
             <w:tcW w:w="3000" w:type="dxa"/>
@@ -2466,12 +2310,6 @@
         </w:tc>
       </w:tr>
       <w:tr>
-        <w:tblPrEx>
-          <w:tblCellMar>
-            <w:top w:w="0" w:type="dxa"/>
-            <w:bottom w:w="0" w:type="dxa"/>
-          </w:tblCellMar>
-        </w:tblPrEx>
         <w:tc>
           <w:tcPr>
             <w:tcW w:w="3000" w:type="dxa"/>
@@ -2529,12 +2367,6 @@
         </w:tc>
       </w:tr>
       <w:tr>
-        <w:tblPrEx>
-          <w:tblCellMar>
-            <w:top w:w="0" w:type="dxa"/>
-            <w:bottom w:w="0" w:type="dxa"/>
-          </w:tblCellMar>
-        </w:tblPrEx>
         <w:tc>
           <w:tcPr>
             <w:tcW w:w="3000" w:type="dxa"/>
@@ -2621,10 +2453,7 @@
         <w:spacing w:after="120"/>
       </w:pPr>
       <w:r>
-        <w:t>The MA specialization "Linguistics: Theory and Applications" aims at introducing students to conducting research on the English language with various technological tools (research methods, corpora), to studying linguistic applications affected by the use of technology (e.g. psycholinguistic research), to developing basic skills in using computational and statistical techniques of linguistic data analysis, to analyzing the language of technology (e.g. digital speech analysis), and to studying learning Englis</w:t>
-      </w:r>
-      <w:r>
-        <w:t>h as an L2 via apps and/or technology.</w:t>
+        <w:t>The MA specialization "Linguistics: Theory and Applications" aims at introducing students to conducting research on the English language with various technological tools (research methods, corpora), to studying linguistic applications affected by the use of technology (e.g. psycholinguistic research), to developing basic skills in using computational and statistical techniques of linguistic data analysis, to analyzing the language of technology (e.g. digital speech analysis), and to studying learning English as an L2 via apps and/or technology.</w:t>
       </w:r>
     </w:p>
     <w:p>
@@ -2640,10 +2469,7 @@
         <w:spacing w:after="120"/>
       </w:pPr>
       <w:r>
-        <w:t>The MA specialization "Translation Studies" aims at introducing students to studying meaning transfer between Greek and English in various genres and contexts, focusing on research-oriented approaches to translation, interpreting in real-life situations, and the technologies that are transforming the profession. Topics include research methodology in translation studies, translation theory and practice, psycholinguistic aspects of translation, globalization and language contact, and technological aspects of</w:t>
-      </w:r>
-      <w:r>
-        <w:t xml:space="preserve"> translation practices.</w:t>
+        <w:t>The MA specialization "Translation Studies" aims at introducing students to studying meaning transfer between Greek and English in various genres and contexts, focusing on research-oriented approaches to translation, interpreting in real-life situations, and the technologies that are transforming the profession. Topics include research methodology in translation studies, translation theory and practice, psycholinguistic aspects of translation, globalization and language contact, and technological aspects of translation practices.</w:t>
       </w:r>
     </w:p>
     <w:p>
@@ -2694,12 +2520,6 @@
         <w:gridCol w:w="1526"/>
       </w:tblGrid>
       <w:tr>
-        <w:tblPrEx>
-          <w:tblCellMar>
-            <w:top w:w="0" w:type="dxa"/>
-            <w:bottom w:w="0" w:type="dxa"/>
-          </w:tblCellMar>
-        </w:tblPrEx>
         <w:tc>
           <w:tcPr>
             <w:tcW w:w="5000" w:type="dxa"/>
@@ -2789,12 +2609,6 @@
         </w:tc>
       </w:tr>
       <w:tr>
-        <w:tblPrEx>
-          <w:tblCellMar>
-            <w:top w:w="0" w:type="dxa"/>
-            <w:bottom w:w="0" w:type="dxa"/>
-          </w:tblCellMar>
-        </w:tblPrEx>
         <w:tc>
           <w:tcPr>
             <w:tcW w:w="5000" w:type="dxa"/>
@@ -2875,12 +2689,6 @@
         </w:tc>
       </w:tr>
       <w:tr>
-        <w:tblPrEx>
-          <w:tblCellMar>
-            <w:top w:w="0" w:type="dxa"/>
-            <w:bottom w:w="0" w:type="dxa"/>
-          </w:tblCellMar>
-        </w:tblPrEx>
         <w:tc>
           <w:tcPr>
             <w:tcW w:w="5000" w:type="dxa"/>
@@ -2961,12 +2769,6 @@
         </w:tc>
       </w:tr>
       <w:tr>
-        <w:tblPrEx>
-          <w:tblCellMar>
-            <w:top w:w="0" w:type="dxa"/>
-            <w:bottom w:w="0" w:type="dxa"/>
-          </w:tblCellMar>
-        </w:tblPrEx>
         <w:tc>
           <w:tcPr>
             <w:tcW w:w="5000" w:type="dxa"/>
@@ -3047,12 +2849,6 @@
         </w:tc>
       </w:tr>
       <w:tr>
-        <w:tblPrEx>
-          <w:tblCellMar>
-            <w:top w:w="0" w:type="dxa"/>
-            <w:bottom w:w="0" w:type="dxa"/>
-          </w:tblCellMar>
-        </w:tblPrEx>
         <w:tc>
           <w:tcPr>
             <w:tcW w:w="5000" w:type="dxa"/>
@@ -3164,12 +2960,6 @@
         <w:gridCol w:w="1526"/>
       </w:tblGrid>
       <w:tr>
-        <w:tblPrEx>
-          <w:tblCellMar>
-            <w:top w:w="0" w:type="dxa"/>
-            <w:bottom w:w="0" w:type="dxa"/>
-          </w:tblCellMar>
-        </w:tblPrEx>
         <w:tc>
           <w:tcPr>
             <w:tcW w:w="5000" w:type="dxa"/>
@@ -3259,12 +3049,6 @@
         </w:tc>
       </w:tr>
       <w:tr>
-        <w:tblPrEx>
-          <w:tblCellMar>
-            <w:top w:w="0" w:type="dxa"/>
-            <w:bottom w:w="0" w:type="dxa"/>
-          </w:tblCellMar>
-        </w:tblPrEx>
         <w:tc>
           <w:tcPr>
             <w:tcW w:w="5000" w:type="dxa"/>
@@ -3345,12 +3129,6 @@
         </w:tc>
       </w:tr>
       <w:tr>
-        <w:tblPrEx>
-          <w:tblCellMar>
-            <w:top w:w="0" w:type="dxa"/>
-            <w:bottom w:w="0" w:type="dxa"/>
-          </w:tblCellMar>
-        </w:tblPrEx>
         <w:tc>
           <w:tcPr>
             <w:tcW w:w="5000" w:type="dxa"/>
@@ -3431,12 +3209,6 @@
         </w:tc>
       </w:tr>
       <w:tr>
-        <w:tblPrEx>
-          <w:tblCellMar>
-            <w:top w:w="0" w:type="dxa"/>
-            <w:bottom w:w="0" w:type="dxa"/>
-          </w:tblCellMar>
-        </w:tblPrEx>
         <w:tc>
           <w:tcPr>
             <w:tcW w:w="5000" w:type="dxa"/>
@@ -3517,12 +3289,6 @@
         </w:tc>
       </w:tr>
       <w:tr>
-        <w:tblPrEx>
-          <w:tblCellMar>
-            <w:top w:w="0" w:type="dxa"/>
-            <w:bottom w:w="0" w:type="dxa"/>
-          </w:tblCellMar>
-        </w:tblPrEx>
         <w:tc>
           <w:tcPr>
             <w:tcW w:w="5000" w:type="dxa"/>
@@ -3648,7 +3414,19 @@
         <w:spacing w:after="120"/>
       </w:pPr>
       <w:r>
-        <w:t>For the 2026-2028 cycle, the Steering Committee has replaced the written entrance examination with a portfolio-based evaluation and an oral interview. Candidates are evaluated on the basis of portfolio evaluation (70%) and oral interview (30%).</w:t>
+        <w:t xml:space="preserve">For the 2026-2028 cycle, the Steering Committee has replaced the written entrance examination with a portfolio-based evaluation and an oral interview. Candidates are evaluated on the basis of </w:t>
+      </w:r>
+      <w:r>
+        <w:t>Portfolio evaluation (50%)</w:t>
+      </w:r>
+      <w:r>
+        <w:t xml:space="preserve"> and </w:t>
+      </w:r>
+      <w:r>
+        <w:t>Oral interview (50%)</w:t>
+      </w:r>
+      <w:r>
+        <w:t>.</w:t>
       </w:r>
     </w:p>
     <w:p>
@@ -3820,7 +3598,13 @@
         <w:spacing w:after="60"/>
       </w:pPr>
       <w:r>
-        <w:t>Certification of knowledge of English (C2 level, excellent knowledge) for graduates from other departments than the Department of English Language and Literature.</w:t>
+        <w:t>Certification of knowledge of English (</w:t>
+      </w:r>
+      <w:r>
+        <w:t>C1 level</w:t>
+      </w:r>
+      <w:r>
+        <w:t>, excellent knowledge) for graduates from other departments than the Department of English Language and Literature.</w:t>
       </w:r>
     </w:p>
     <w:p>
@@ -3887,13 +3671,30 @@
           <w:b/>
           <w:bCs/>
         </w:rPr>
-        <w:t xml:space="preserve">Portfolio evaluation (70% of the total marks). </w:t>
-      </w:r>
-      <w:r>
-        <w:t>The portfolio comprises: BA grade (minimum Very Good; a lower grade may be accepted if candidates have received Very Good in specific undergraduate courses relevant to the Postgraduate Programme, or if they have obtained a second degree, another postgraduate title, research experience, or have written a fully developed research paper); grades of undergraduate courses relevant to the postgraduate specialization; research experience (e.g. seminars, participation in research projects, publications); English la</w:t>
-      </w:r>
-      <w:r>
-        <w:t>nguage proficiency (C2 level, mandatory); one (1) letter of recommendation; relevant professional experience and knowledge of new technologies.</w:t>
+        <w:t>Portfolio evaluation (</w:t>
+      </w:r>
+      <w:r>
+        <w:rPr>
+          <w:b/>
+          <w:bCs/>
+        </w:rPr>
+        <w:t>50%</w:t>
+      </w:r>
+      <w:r>
+        <w:rPr>
+          <w:b/>
+          <w:bCs/>
+        </w:rPr>
+        <w:t xml:space="preserve"> of the total marks). </w:t>
+      </w:r>
+      <w:r>
+        <w:t>The portfolio comprises: BA grade (minimum Very Good; a lower grade may be accepted if candidates have received Very Good in specific undergraduate courses relevant to the Postgraduate Programme, or if they have obtained a second degree, another postgraduate title, research experience, or have written a fully developed research paper); grades of undergraduate courses relevant to the postgraduate specialization; research experience (e.g. seminars, participation in research projects, publications); English language proficiency (</w:t>
+      </w:r>
+      <w:r>
+        <w:t>C1 level</w:t>
+      </w:r>
+      <w:r>
+        <w:t>, mandatory); one (1) letter of recommendation; relevant professional experience and knowledge of new technologies.</w:t>
       </w:r>
     </w:p>
     <w:p>
@@ -3910,7 +3711,21 @@
           <w:b/>
           <w:bCs/>
         </w:rPr>
-        <w:t xml:space="preserve">Oral interview (30% of the total marks, pass mark: 6/10). </w:t>
+        <w:t>Oral interview (</w:t>
+      </w:r>
+      <w:r>
+        <w:rPr>
+          <w:b/>
+          <w:bCs/>
+        </w:rPr>
+        <w:t>50%</w:t>
+      </w:r>
+      <w:r>
+        <w:rPr>
+          <w:b/>
+          <w:bCs/>
+        </w:rPr>
+        <w:t xml:space="preserve"> of the total marks, pass mark: 6/10). </w:t>
       </w:r>
       <w:r>
         <w:t>The Selection Committee evaluates academic background, research interests, critical engagement with translation-related topics, and intellectual potential. Only candidates whose portfolio score meets the minimum threshold participate in the oral interview.</w:t>
@@ -3937,10 +3752,7 @@
         <w:spacing w:after="120"/>
       </w:pPr>
       <w:r>
-        <w:t>Attendance is mandatory. Postgraduate students may have up to two justified absences in every subject per term, for medical reasons (supported by official attestation from a public hospital) or because of serious personal reasons (certified with a signed declaration). In case of surpassing the limit of two absences because of special and exceptional reasons, the student submits an application to the Steering Committee with all relevant documentation for approval, which is then set before the Assembly of the</w:t>
-      </w:r>
-      <w:r>
-        <w:t xml:space="preserve"> Faculty of English Language and Literature. If the application is rejected, the student leaves the programme.</w:t>
+        <w:t>Attendance is mandatory. Postgraduate students may have up to two justified absences in every subject per term, for medical reasons (supported by official attestation from a public hospital) or because of serious personal reasons (certified with a signed declaration). In case of surpassing the limit of two absences because of special and exceptional reasons, the student submits an application to the Steering Committee with all relevant documentation for approval, which is then set before the Assembly of the Faculty of English Language and Literature. If the application is rejected, the student leaves the programme.</w:t>
       </w:r>
     </w:p>
     <w:p>
@@ -3968,10 +3780,7 @@
         <w:spacing w:after="120"/>
       </w:pPr>
       <w:r>
-        <w:t>Student assessment in MA courses is determined by the instructor and is referred to in the course description. As a general rule, the overall mark of a module is based on the aggregation of independent graded sources (for example, research papers submitted during the semester, written or oral exams, oral presentations and other research or educational activities). The overall grade for each module, and the dissertation, is based on a 6-10 scale (6 being the minimum passing grade and 10 being the highest) an</w:t>
-      </w:r>
-      <w:r>
-        <w:t>d is submitted to the Secretariat of the Department.</w:t>
+        <w:t>Student assessment in MA courses is determined by the instructor and is referred to in the course description. As a general rule, the overall mark of a module is based on the aggregation of independent graded sources (for example, research papers submitted during the semester, written or oral exams, oral presentations and other research or educational activities). The overall grade for each module, and the dissertation, is based on a 6-10 scale (6 being the minimum passing grade and 10 being the highest) and is submitted to the Secretariat of the Department.</w:t>
       </w:r>
     </w:p>
     <w:p>
@@ -3987,10 +3796,7 @@
         <w:spacing w:after="120"/>
       </w:pPr>
       <w:r>
-        <w:t>As defined in the Regulation of the MA Programme, if students fail in one or more courses, they may fail the whole Programme; the student should then ask to be examined by a three-party committee, whose members have the same or relevant specialization and who are selected by the Department Assembly. The instructor is excluded from the three-party exam committee (par. 6, art. 34, N. 4485/2017). If the student is examined through a written assignment, the assignment is re-assessed by the three-party exam comm</w:t>
-      </w:r>
-      <w:r>
-        <w:t>ittee.</w:t>
+        <w:t>As defined in the Regulation of the MA Programme, if students fail in one or more courses, they may fail the whole Programme; the student should then ask to be examined by a three-party committee, whose members have the same or relevant specialization and who are selected by the Department Assembly. The instructor is excluded from the three-party exam committee (par. 6, art. 34, N. 4485/2017). If the student is examined through a written assignment, the assignment is re-assessed by the three-party exam committee.</w:t>
       </w:r>
     </w:p>
     <w:p>
@@ -4063,10 +3869,7 @@
         <w:spacing w:after="100"/>
       </w:pPr>
       <w:r>
-        <w:t>On a Steering Committee suggestion, the Assembly of the Department of English Language and Literature may decide to discontinue a student's attendance in the event of any of the following: poor attendance (only two justified absences are allowed per course, for medical reasons, as specified in article 7 of the Regulation); failure of examination in one or more modules (including the examination by the three-member Committee) without completing the Programme; exceeding the maximum study duration; breaking ex</w:t>
-      </w:r>
-      <w:r>
-        <w:t>isting regulations according to the relevant Disciplinary Board code; ex officio, after an application to the Department; or committing plagiarism (Law 2121/93).</w:t>
+        <w:t>On a Steering Committee suggestion, the Assembly of the Department of English Language and Literature may decide to discontinue a student's attendance in the event of any of the following: poor attendance (only two justified absences are allowed per course, for medical reasons, as specified in article 7 of the Regulation); failure of examination in one or more modules (including the examination by the three-member Committee) without completing the Programme; exceeding the maximum study duration; breaking existing regulations according to the relevant Disciplinary Board code; ex officio, after an application to the Department; or committing plagiarism (Law 2121/93).</w:t>
       </w:r>
     </w:p>
     <w:p>
@@ -4321,10 +4124,7 @@
         <w:spacing w:after="160"/>
       </w:pPr>
       <w:r>
-        <w:t>This course examines the research methodology in translation studies. It focuses on types of research (comparison of original and translated discourse: parallel or comparable, quality and quantity approaches), on the types and usefulness of theoretical models, on setting up hypotheses, on data collection, and on the relationship between the research question and the analytical apparatus. It also focuses on the writing of the research report and on its oral presentation (structure, writing conventions, citat</w:t>
-      </w:r>
-      <w:r>
-        <w:t>ion practice), on self-evaluation of research according to criteria that establish credibility and academic style, and on presenting potential weak points constructively. Assessment is by oral presentation, written research project and weekly assignments.</w:t>
+        <w:t>This course examines the research methodology in translation studies. It focuses on types of research (comparison of original and translated discourse: parallel or comparable, quality and quantity approaches), on the types and usefulness of theoretical models, on setting up hypotheses, on data collection, and on the relationship between the research question and the analytical apparatus. It also focuses on the writing of the research report and on its oral presentation (structure, writing conventions, citation practice), on self-evaluation of research according to criteria that establish credibility and academic style, and on presenting potential weak points constructively. Assessment is by oral presentation, written research project and weekly assignments.</w:t>
       </w:r>
     </w:p>
     <w:p>
@@ -4380,10 +4180,7 @@
         <w:spacing w:after="160"/>
       </w:pPr>
       <w:r>
-        <w:t>This course examines translation behaviour and how it is affected by the interplay between linguistic and psycholinguistic factors. Beyond the semantic, syntactic and morpho-phonological properties of the two languages that may influence a translator's decision-making, the course considers the psycholinguistic conditions of bilingual processing: lexical access, cross-language activation, working memory and cognitive load. The course offers lectures and develops dialogue through the presentation and study of</w:t>
-      </w:r>
-      <w:r>
-        <w:t xml:space="preserve"> relevant articles from Psycholinguistics and Translation Studies. Students' performance is assessed through oral and written research projects.</w:t>
+        <w:t>This course examines translation behaviour and how it is affected by the interplay between linguistic and psycholinguistic factors. Beyond the semantic, syntactic and morpho-phonological properties of the two languages that may influence a translator's decision-making, the course considers the psycholinguistic conditions of bilingual processing: lexical access, cross-language activation, working memory and cognitive load. The course offers lectures and develops dialogue through the presentation and study of relevant articles from Psycholinguistics and Translation Studies. Students' performance is assessed through oral and written research projects.</w:t>
       </w:r>
     </w:p>
     <w:p>
@@ -4439,10 +4236,7 @@
         <w:spacing w:after="160"/>
       </w:pPr>
       <w:r>
-        <w:t xml:space="preserve">A practical workshop on contemporary translation across genres. Students engage with real translation tasks (literary, journalistic, technical and audiovisual), prepare publication-ready outputs and reflect critically on translator decisions. The seminar combines weekly translation exercises, group discussion of solutions and individual feedback, working from English into Greek and from Greek into English. Students develop a personal translation portfolio. Assessment is portfolio-based with an oral defence </w:t>
-      </w:r>
-      <w:r>
-        <w:t>of selected translations.</w:t>
+        <w:t>A practical workshop on contemporary translation across genres. Students engage with real translation tasks (literary, journalistic, technical and audiovisual), prepare publication-ready outputs and reflect critically on translator decisions. The seminar combines weekly translation exercises, group discussion of solutions and individual feedback, working from English into Greek and from Greek into English. Students develop a personal translation portfolio. Assessment is portfolio-based with an oral defence of selected translations.</w:t>
       </w:r>
     </w:p>
     <w:p>
@@ -4498,10 +4292,7 @@
         <w:spacing w:after="160"/>
       </w:pPr>
       <w:r>
-        <w:t>Text as the primary unit of translation. The course examines cohesion, coherence, genre, register and discourse organisation across English and Greek, drawing on systemic-functional and corpus-based approaches. Students learn to use tools for textual analysis (concordancers, annotation schemes, parallel corpora) and apply them to translator decision-making. Topics include thematic structure, lexical patterns, evaluation in discourse, and how textual properties shift across translation. Assessment is by anal</w:t>
-      </w:r>
-      <w:r>
-        <w:t>ytical assignments and a final corpus-based project.</w:t>
+        <w:t>Text as the primary unit of translation. The course examines cohesion, coherence, genre, register and discourse organisation across English and Greek, drawing on systemic-functional and corpus-based approaches. Students learn to use tools for textual analysis (concordancers, annotation schemes, parallel corpora) and apply them to translator decision-making. Topics include thematic structure, lexical patterns, evaluation in discourse, and how textual properties shift across translation. Assessment is by analytical assignments and a final corpus-based project.</w:t>
       </w:r>
     </w:p>
     <w:p>
@@ -4565,17 +4356,11 @@
         <w:spacing w:after="160"/>
       </w:pPr>
       <w:r>
-        <w:t>The course examines strategies of interlingual and intra-lingual translation of older and dialectal texts, taking a historical-linguistic approach (for example, translating Beowulf into present-day English, or Beowulf into Modern Greek). It also examines the role of translation in language change and language contact. Translations and translators have greatly influenced language evolution, and everything related to language: dictionaries, alphabets, national literatures, knowledge dissemination, and the exp</w:t>
-      </w:r>
-      <w:r>
-        <w:t xml:space="preserve">ansion and practice of religions. Bible translation has attracted the attention of translation and historical linguistic scholarship as a privileged site of contact-induced change. A central methodological thread running through the course is the meta-digital analysis of </w:t>
+        <w:t xml:space="preserve">The course examines strategies of interlingual and intra-lingual translation of older and dialectal texts, taking a historical-linguistic approach (for example, translating Beowulf into present-day English, or Beowulf into Modern Greek). It also examines the role of translation in language change and language contact. Translations and translators have greatly influenced language evolution, and everything related to language: dictionaries, alphabets, national literatures, knowledge dissemination, and the expansion and practice of religions. Bible translation has attracted the attention of translation and historical linguistic scholarship as a privileged site of contact-induced change. A central methodological thread running through the course is the meta-digital analysis of diachronic and contact-driven variation: students work with digital corpora, annotation tools, and </w:t>
       </w:r>
       <w:r>
         <w:lastRenderedPageBreak/>
-        <w:t>diachronic and contact-driven variation: students work with digital corpora, annotation tools, and corpus-query platforms to trace how variation patterns are refracted, neutralized, or amplified in translation across time and language pairs</w:t>
-      </w:r>
-      <w:r>
-        <w:t>. The GlossaContact Lab resources, including diachronic corpora of Greek, English, and contact varieties, provide the empirical base for hands-on investigation. Assessment is by a final research assignment, weekly assignments and quizzes.</w:t>
+        <w:t>corpus-query platforms to trace how variation patterns are refracted, neutralized, or amplified in translation across time and language pairs. The GlossaContact Lab resources, including diachronic corpora of Greek, English, and contact varieties, provide the empirical base for hands-on investigation. Assessment is by a final research assignment, weekly assignments and quizzes.</w:t>
       </w:r>
     </w:p>
     <w:p>
@@ -4631,10 +4416,7 @@
         <w:spacing w:after="160"/>
       </w:pPr>
       <w:r>
-        <w:t>The course comprises two parallel axes: a theoretical part and a practical part. On the theoretical side students engage with older and more recent trends in Translation Studies, and learn to assess the quality of translation choices in light of competing frameworks (equivalence, skopos, descriptive translation studies, sociological approaches). On the practical side, students translate texts of increasing complexity across genres (literary, journalistic, specialised) and reflect on the cultural mediation i</w:t>
-      </w:r>
-      <w:r>
-        <w:t>nvolved in each task. Assessment is by translation portfolio plus a final theoretical essay.</w:t>
+        <w:t>The course comprises two parallel axes: a theoretical part and a practical part. On the theoretical side students engage with older and more recent trends in Translation Studies, and learn to assess the quality of translation choices in light of competing frameworks (equivalence, skopos, descriptive translation studies, sociological approaches). On the practical side, students translate texts of increasing complexity across genres (literary, journalistic, specialised) and reflect on the cultural mediation involved in each task. Assessment is by translation portfolio plus a final theoretical essay.</w:t>
       </w:r>
     </w:p>
     <w:p>
@@ -4690,10 +4472,7 @@
         <w:spacing w:after="160"/>
       </w:pPr>
       <w:r>
-        <w:t>Literacy practices and their consequences for translation. The course addresses writing systems, schooling traditions, and the multilingual and digital literacies that shape contemporary readers and translators. Topics include the cognitive and social dimensions of reading and writing across languages, the place of translation in literacy education, and the way emerging digital and AI-mediated literacies reshape translation practice. Assessment is by a research essay and a small-scale empirical project on a</w:t>
-      </w:r>
-      <w:r>
-        <w:t xml:space="preserve"> literacy practice of the student's choice.</w:t>
+        <w:t>Literacy practices and their consequences for translation. The course addresses writing systems, schooling traditions, and the multilingual and digital literacies that shape contemporary readers and translators. Topics include the cognitive and social dimensions of reading and writing across languages, the place of translation in literacy education, and the way emerging digital and AI-mediated literacies reshape translation practice. Assessment is by a research essay and a small-scale empirical project on a literacy practice of the student's choice.</w:t>
       </w:r>
     </w:p>
     <w:p>
@@ -4749,10 +4528,7 @@
         <w:spacing w:after="160"/>
       </w:pPr>
       <w:r>
-        <w:t>Students undertake real translation projects in order to consolidate the basic principles of translation practice, search for translation resources to clarify concepts and terminology, and edit translated texts to publication standard. Several external and internal scholars join the course to contribute their domain expertise across specialised fields (legal, scientific, audiovisual, literary). Each student delivers a substantial publication-ready translation project as the basis for assessment, accompanied</w:t>
-      </w:r>
-      <w:r>
-        <w:t xml:space="preserve"> by a translator's commentary documenting the decisions taken.</w:t>
+        <w:t>Students undertake real translation projects in order to consolidate the basic principles of translation practice, search for translation resources to clarify concepts and terminology, and edit translated texts to publication standard. Several external and internal scholars join the course to contribute their domain expertise across specialised fields (legal, scientific, audiovisual, literary). Each student delivers a substantial publication-ready translation project as the basis for assessment, accompanied by a translator's commentary documenting the decisions taken.</w:t>
       </w:r>
     </w:p>
     <w:p>
@@ -4892,7 +4668,6 @@
         <w:spacing w:after="120"/>
       </w:pPr>
       <w:r>
-        <w:lastRenderedPageBreak/>
         <w:t>include an adequate number of citations in the main body. The reference list at the end should be presented according to international standards of referencing.</w:t>
       </w:r>
     </w:p>
@@ -4905,6 +4680,7 @@
           <w:b/>
           <w:bCs/>
         </w:rPr>
+        <w:lastRenderedPageBreak/>
         <w:t>Please note the following:</w:t>
       </w:r>
     </w:p>
@@ -4960,10 +4736,7 @@
         <w:spacing w:after="120"/>
       </w:pPr>
       <w:r>
-        <w:t>The grade of the dissertation is submitted to the Secretariat of the Department once the marking procedure is completed. The student resubmits the dissertation (with the improvements) in its final form in one copy at the Secretariat of the Department. Dissertations, after approval by the examining committee, are necessarily posted at the website of the Department (art. 34, par. 5 N. 4485/17). Furthermore, an electronic submission of dissertations follows at the Digital Repository "PERGAMOS", following the S</w:t>
-      </w:r>
-      <w:r>
-        <w:t>enate of NKUA decision.</w:t>
+        <w:t>The grade of the dissertation is submitted to the Secretariat of the Department once the marking procedure is completed. The student resubmits the dissertation (with the improvements) in its final form in one copy at the Secretariat of the Department. Dissertations, after approval by the examining committee, are necessarily posted at the website of the Department (art. 34, par. 5 N. 4485/17). Furthermore, an electronic submission of dissertations follows at the Digital Repository "PERGAMOS", following the Senate of NKUA decision.</w:t>
       </w:r>
     </w:p>
     <w:p>

</xml_diff>

<commit_message>
Study guide: add Eligible Applicants paragraph (broader Humanities, FEK)
</commit_message>
<xml_diff>
--- a/pms_study_guide_en.docx
+++ b/pms_study_guide_en.docx
@@ -1056,7 +1056,6 @@
                 <w:sz w:val="20"/>
                 <w:szCs w:val="20"/>
               </w:rPr>
-              <w:lastRenderedPageBreak/>
               <w:t>Department Site</w:t>
             </w:r>
           </w:p>
@@ -1296,7 +1295,6 @@
         <w:pStyle w:val="Heading3"/>
       </w:pPr>
       <w:r>
-        <w:lastRenderedPageBreak/>
         <w:t>Library of the School of Philosophy</w:t>
       </w:r>
     </w:p>
@@ -1570,7 +1568,6 @@
                 <w:sz w:val="20"/>
                 <w:szCs w:val="20"/>
               </w:rPr>
-              <w:lastRenderedPageBreak/>
               <w:t>Scholarships</w:t>
             </w:r>
           </w:p>
@@ -2485,7 +2482,6 @@
         <w:spacing w:after="100"/>
       </w:pPr>
       <w:r>
-        <w:lastRenderedPageBreak/>
         <w:t>Each semester offers a course pool from which students select three courses (10 ECTS each, 30 ECTS per semester). The third semester is dedicated to the MA Dissertation (30 ECTS).</w:t>
       </w:r>
     </w:p>
@@ -3431,6 +3427,14 @@
     </w:p>
     <w:p>
       <w:pPr>
+        <w:spacing w:after="120"/>
+      </w:pPr>
+      <w:r>
+        <w:t>Eligible Applicants. The MA Programme welcomes graduates of the Department of English Language and Literature, as well as graduates of related Humanities departments (Linguistics, Translation Studies, Philology, Modern Languages and Literatures, Classics, Comparative Literature, and related disciplines). Graduates of other Humanities programmes with a strong English-language background are also welcome to apply, in accordance with the programme's official decree (FEK 1501/B'/17.03.2026). International graduates with equivalent qualifications from recognised foreign universities (DOATAP) and students completing their 8th semester (pending certificate of completion) may also apply.</w:t>
+      </w:r>
+    </w:p>
+    <w:p>
+      <w:pPr>
         <w:pStyle w:val="Heading2"/>
       </w:pPr>
       <w:r>
@@ -3545,7 +3549,6 @@
         <w:spacing w:after="60"/>
       </w:pPr>
       <w:r>
-        <w:lastRenderedPageBreak/>
         <w:t>Full transcript of undergraduate course grades.</w:t>
       </w:r>
     </w:p>
@@ -3760,11 +3763,7 @@
         <w:spacing w:after="120"/>
       </w:pPr>
       <w:r>
-        <w:t xml:space="preserve">Classes are held during two study semesters, in the fall and the spring, each one of which runs for at least 13 weeks of teaching and three weeks of exams. Potentially missed classes are replaced. The date and time of the make-up class are posted on the website of the MA Programme. Exams take place during January/February for the Fall semester and in June for the Spring semester, for all </w:t>
-      </w:r>
-      <w:r>
-        <w:lastRenderedPageBreak/>
-        <w:t>classes that include exams. There is no re-sit exam period in September. Assignments, essays and other projects must be strictly delivered within the designated deadlines.</w:t>
+        <w:t>Classes are held during two study semesters, in the fall and the spring, each one of which runs for at least 13 weeks of teaching and three weeks of exams. Potentially missed classes are replaced. The date and time of the make-up class are posted on the website of the MA Programme. Exams take place during January/February for the Fall semester and in June for the Spring semester, for all classes that include exams. There is no re-sit exam period in September. Assignments, essays and other projects must be strictly delivered within the designated deadlines.</w:t>
       </w:r>
     </w:p>
     <w:p>
@@ -3877,11 +3876,7 @@
         <w:spacing w:after="100"/>
       </w:pPr>
       <w:r>
-        <w:t xml:space="preserve">More specifically: Plagiarism is the intentional or unintentional verbatim or paraphrased reproduction of parts of a text (irrespective of size) from any print source (e.g. articles, books, newspapers, magazines, other students' papers) or online source, without a full bibliographical reference. Any third-party interference to the content or structure of a paper (with no relevant </w:t>
-      </w:r>
-      <w:r>
-        <w:lastRenderedPageBreak/>
-        <w:t>reference) or a paper written by a third party are also considered plagiarism. Plagiarism is a serious misconduct of academic ethics and leads to sanctions which, depending on the severity (to be determined by the Assembly of the Department), may vary from the student receiving a fail for the paper, failing the course, or permanently leaving the MA Programme. This applies to essays/papers in particular courses as well as to the MA dissertation.</w:t>
+        <w:t>More specifically: Plagiarism is the intentional or unintentional verbatim or paraphrased reproduction of parts of a text (irrespective of size) from any print source (e.g. articles, books, newspapers, magazines, other students' papers) or online source, without a full bibliographical reference. Any third-party interference to the content or structure of a paper (with no relevant reference) or a paper written by a third party are also considered plagiarism. Plagiarism is a serious misconduct of academic ethics and leads to sanctions which, depending on the severity (to be determined by the Assembly of the Department), may vary from the student receiving a fail for the paper, failing the course, or permanently leaving the MA Programme. This applies to essays/papers in particular courses as well as to the MA dissertation.</w:t>
       </w:r>
     </w:p>
     <w:p>
@@ -4051,7 +4046,6 @@
         <w:pStyle w:val="Heading2"/>
       </w:pPr>
       <w:r>
-        <w:lastRenderedPageBreak/>
         <w:t>Specialization "Translation Studies" (2026-2028)</w:t>
       </w:r>
     </w:p>
@@ -4356,11 +4350,7 @@
         <w:spacing w:after="160"/>
       </w:pPr>
       <w:r>
-        <w:t xml:space="preserve">The course examines strategies of interlingual and intra-lingual translation of older and dialectal texts, taking a historical-linguistic approach (for example, translating Beowulf into present-day English, or Beowulf into Modern Greek). It also examines the role of translation in language change and language contact. Translations and translators have greatly influenced language evolution, and everything related to language: dictionaries, alphabets, national literatures, knowledge dissemination, and the expansion and practice of religions. Bible translation has attracted the attention of translation and historical linguistic scholarship as a privileged site of contact-induced change. A central methodological thread running through the course is the meta-digital analysis of diachronic and contact-driven variation: students work with digital corpora, annotation tools, and </w:t>
-      </w:r>
-      <w:r>
-        <w:lastRenderedPageBreak/>
-        <w:t>corpus-query platforms to trace how variation patterns are refracted, neutralized, or amplified in translation across time and language pairs. The GlossaContact Lab resources, including diachronic corpora of Greek, English, and contact varieties, provide the empirical base for hands-on investigation. Assessment is by a final research assignment, weekly assignments and quizzes.</w:t>
+        <w:t>The course examines strategies of interlingual and intra-lingual translation of older and dialectal texts, taking a historical-linguistic approach (for example, translating Beowulf into present-day English, or Beowulf into Modern Greek). It also examines the role of translation in language change and language contact. Translations and translators have greatly influenced language evolution, and everything related to language: dictionaries, alphabets, national literatures, knowledge dissemination, and the expansion and practice of religions. Bible translation has attracted the attention of translation and historical linguistic scholarship as a privileged site of contact-induced change. A central methodological thread running through the course is the meta-digital analysis of diachronic and contact-driven variation: students work with digital corpora, annotation tools, and corpus-query platforms to trace how variation patterns are refracted, neutralized, or amplified in translation across time and language pairs. The GlossaContact Lab resources, including diachronic corpora of Greek, English, and contact varieties, provide the empirical base for hands-on investigation. Assessment is by a final research assignment, weekly assignments and quizzes.</w:t>
       </w:r>
     </w:p>
     <w:p>
@@ -4680,7 +4670,6 @@
           <w:b/>
           <w:bCs/>
         </w:rPr>
-        <w:lastRenderedPageBreak/>
         <w:t>Please note the following:</w:t>
       </w:r>
     </w:p>

</xml_diff>

<commit_message>
Study guide: 'if any' / 'where applicable' on research and professional experience in portfolio criterion
</commit_message>
<xml_diff>
--- a/pms_study_guide_en.docx
+++ b/pms_study_guide_en.docx
@@ -3691,13 +3691,22 @@
         <w:t xml:space="preserve"> of the total marks). </w:t>
       </w:r>
       <w:r>
-        <w:t>The portfolio comprises: BA grade (minimum Very Good; a lower grade may be accepted if candidates have received Very Good in specific undergraduate courses relevant to the Postgraduate Programme, or if they have obtained a second degree, another postgraduate title, research experience, or have written a fully developed research paper); grades of undergraduate courses relevant to the postgraduate specialization; research experience (e.g. seminars, participation in research projects, publications); English language proficiency (</w:t>
+        <w:t xml:space="preserve">The portfolio comprises: BA grade (minimum Very Good; a lower grade may be accepted if candidates have received Very Good in specific undergraduate courses relevant to the Postgraduate Programme, or if they have obtained a second degree, another postgraduate title, research experience, or have written a fully developed research paper); grades of undergraduate courses relevant to the postgraduate specialization; </w:t>
+      </w:r>
+      <w:r>
+        <w:t>research experience, if any (e.g. seminars, participation in research projects, publications);</w:t>
+      </w:r>
+      <w:r>
+        <w:t xml:space="preserve"> English language proficiency (</w:t>
       </w:r>
       <w:r>
         <w:t>C1 level</w:t>
       </w:r>
       <w:r>
-        <w:t>, mandatory); one (1) letter of recommendation; relevant professional experience and knowledge of new technologies.</w:t>
+        <w:t xml:space="preserve">, mandatory); one (1) letter of recommendation; relevant </w:t>
+      </w:r>
+      <w:r>
+        <w:t>professional experience and knowledge of new technologies, where applicable.</w:t>
       </w:r>
     </w:p>
     <w:p>

</xml_diff>

<commit_message>
PMS courses: Winter add Language Contact (Giannaris); Spring rename Goutsos course to Issues of Text Analysis (moved from Winter); Literacy/Intzidis removed
</commit_message>
<xml_diff>
--- a/pms_study_guide_en.docx
+++ b/pms_study_guide_en.docx
@@ -2867,7 +2867,7 @@
                 <w:sz w:val="20"/>
                 <w:szCs w:val="20"/>
               </w:rPr>
-              <w:t>Text Linguistics</w:t>
+              <w:t>Language Contact</w:t>
             </w:r>
           </w:p>
         </w:tc>
@@ -2893,7 +2893,7 @@
                 <w:sz w:val="20"/>
                 <w:szCs w:val="20"/>
               </w:rPr>
-              <w:t>D. Goutsos</w:t>
+              <w:t>T. Giannaris</w:t>
             </w:r>
           </w:p>
         </w:tc>
@@ -3227,7 +3227,7 @@
                 <w:sz w:val="20"/>
                 <w:szCs w:val="20"/>
               </w:rPr>
-              <w:t>Literacy and Translation</w:t>
+              <w:t>Issues of Text Analysis</w:t>
             </w:r>
           </w:p>
         </w:tc>
@@ -3253,7 +3253,7 @@
                 <w:sz w:val="20"/>
                 <w:szCs w:val="20"/>
               </w:rPr>
-              <w:t>V. Intzidis</w:t>
+              <w:t>D. Goutsos</w:t>
             </w:r>
           </w:p>
         </w:tc>
@@ -4251,7 +4251,7 @@
           <w:b/>
           <w:bCs/>
         </w:rPr>
-        <w:t>Text Linguistics</w:t>
+        <w:t>Language Contact</w:t>
       </w:r>
       <w:r>
         <w:t xml:space="preserve"> </w:t>
@@ -4287,7 +4287,10 @@
         <w:t xml:space="preserve"> </w:t>
       </w:r>
       <w:r>
-        <w:t>Instructor: Dr. Dionysis Goutsos</w:t>
+        <w:t xml:space="preserve">Instructor: </w:t>
+      </w:r>
+      <w:r>
+        <w:t>Dr. Thanasis Giannaris</w:t>
       </w:r>
     </w:p>
     <w:p>
@@ -4295,7 +4298,31 @@
         <w:spacing w:after="160"/>
       </w:pPr>
       <w:r>
-        <w:t>Text as the primary unit of translation. The course examines cohesion, coherence, genre, register and discourse organisation across English and Greek, drawing on systemic-functional and corpus-based approaches. Students learn to use tools for textual analysis (concordancers, annotation schemes, parallel corpora) and apply them to translator decision-making. Topics include thematic structure, lexical patterns, evaluation in discourse, and how textual properties shift across translation. Assessment is by analytical assignments and a final corpus-based project.</w:t>
+        <w:t>Theory and methods of language contact applied to translation.</w:t>
+      </w:r>
+      <w:r>
+        <w:t xml:space="preserve"> </w:t>
+      </w:r>
+      <w:r>
+        <w:t>The course examines borrowing, interference, code-switching, and contact-induced change, with a focus on the role of contact in translation between English and Greek.</w:t>
+      </w:r>
+      <w:r>
+        <w:t xml:space="preserve"> </w:t>
+      </w:r>
+      <w:r>
+        <w:t>Students engage with historical and contemporary case studies of language contact and develop tools for analysing contact phenomena in source and target texts.</w:t>
+      </w:r>
+      <w:r>
+        <w:t xml:space="preserve"> </w:t>
+      </w:r>
+      <w:r>
+        <w:t>Topics include lexical and morphosyntactic borrowing, contact-induced semantic change, and the historical role of translation in language contact.</w:t>
+      </w:r>
+      <w:r>
+        <w:t xml:space="preserve"> </w:t>
+      </w:r>
+      <w:r>
+        <w:t>Assessment is by analytical assignments and a final research paper.</w:t>
       </w:r>
     </w:p>
     <w:p>
@@ -4427,7 +4454,7 @@
           <w:b/>
           <w:bCs/>
         </w:rPr>
-        <w:t>Literacy and Translation</w:t>
+        <w:t>Issues of Text Analysis</w:t>
       </w:r>
       <w:r>
         <w:t xml:space="preserve"> </w:t>
@@ -4463,7 +4490,10 @@
         <w:t xml:space="preserve"> </w:t>
       </w:r>
       <w:r>
-        <w:t>Instructor: Dr. Vangelis Intzidis</w:t>
+        <w:t xml:space="preserve">Instructor: </w:t>
+      </w:r>
+      <w:r>
+        <w:t>Dr. Dionysis Goutsos</w:t>
       </w:r>
     </w:p>
     <w:p>
@@ -4471,7 +4501,25 @@
         <w:spacing w:after="160"/>
       </w:pPr>
       <w:r>
-        <w:t>Literacy practices and their consequences for translation. The course addresses writing systems, schooling traditions, and the multilingual and digital literacies that shape contemporary readers and translators. Topics include the cognitive and social dimensions of reading and writing across languages, the place of translation in literacy education, and the way emerging digital and AI-mediated literacies reshape translation practice. Assessment is by a research essay and a small-scale empirical project on a literacy practice of the student's choice.</w:t>
+        <w:t>Issues of text and discourse analysis applied to translation.</w:t>
+      </w:r>
+      <w:r>
+        <w:t xml:space="preserve"> </w:t>
+      </w:r>
+      <w:r>
+        <w:t>The course examines cohesion, coherence, genre, register and discourse organisation across English and Greek, drawing on systemic-functional and corpus-based approaches.</w:t>
+      </w:r>
+      <w:r>
+        <w:t xml:space="preserve"> </w:t>
+      </w:r>
+      <w:r>
+        <w:t>Students learn to use tools for textual analysis (concordancers, annotation schemes, parallel corpora) and apply them to translator decision-making.</w:t>
+      </w:r>
+      <w:r>
+        <w:t xml:space="preserve"> </w:t>
+      </w:r>
+      <w:r>
+        <w:t>Topics include thematic structure, lexical patterns, evaluation in discourse, and how textual properties shift across translation. Assessment is by analytical assignments and a final corpus-based project.</w:t>
       </w:r>
     </w:p>
     <w:p>

</xml_diff>